<commit_message>
Walkthrough docx: derive every figure from data/ instead of literals; HANDOFF status line
Addresses the /validate note that the Word builder hardcoded funnel, tier,
pass, OSINT and cross-match figures while the HTML pages read them from
data/. load_figures() now sources them from the same files (results.json,
records, crossmatch.json, osint/independent results, grounding, tests/).

Co-Authored-By: Claude Opus 5 <noreply@anthropic.com>
Claude-Session: https://claude.ai/code/session_012y5HiasJdX3meXTxtRR1V2
</commit_message>
<xml_diff>
--- a/docs/How_the_Banyan_Screen_Was_Built.docx
+++ b/docs/How_the_Banyan_Screen_Was_Built.docx
@@ -630,7 +630,7 @@
         <w:t xml:space="preserve">Pass 2 </w:t>
       </w:r>
       <w:r>
-        <w:t>asked a different question: what do Constellation, Valsoft and Everfield already own, and who are the peers of those companies? Ten angles.</w:t>
+        <w:t>asked a different question: what do Constellation, Valsoft and Everfield already own, and who are the peers of those companies? 10 angles.</w:t>
       </w:r>
     </w:p>
     <w:p>
@@ -699,7 +699,7 @@
           <w:color w:val="5B5852"/>
           <w:sz w:val="18"/>
         </w:rPr>
-        <w:t>Figure 3 — Inside pass 3: the seven OSINT angles. Pass 3 also ran 34 ownership verifications against registers, which caught 11 companies described as "founder-owned" on their own websites that are actually PE- or VC-controlled.</w:t>
+        <w:t>Figure 3 — Inside pass 3: the 7 OSINT angles. Pass 3 also ran 34 ownership verifications against registers, which caught 11 companies described as "founder-owned" on their own websites that are actually PE- or VC-controlled.</w:t>
       </w:r>
     </w:p>
     <w:p>
@@ -2319,7 +2319,7 @@
               <w:rPr>
                 <w:sz w:val="19"/>
               </w:rPr>
-              <w:t>53 passing</w:t>
+              <w:t>53 in the suite</w:t>
             </w:r>
           </w:p>
         </w:tc>

</xml_diff>